<commit_message>
Fix calibration table in WIE paper, regenerate all figures at 600 DPI, update README
- paper_fixed.docx: CALCE calibration table (Platt AUC 0.902→0.887, Brier 0.099→0.105)
- plot_shap.py: add standalone no-SOH SHAP figures (Fig06d/e/f)
- All 16 figs_journal_clean/ figures now at 600 DPI
- README: update AUC table, cross-chem table, calibration table to match data
- README: fix 31→30 of 32, correct exception text
- Remove stale figures (Fig02_Calibration_Comparison, Fig06_SHAP_Importance)
- Remove unused data/ supplements (auc_dual_heatmap_H20, calibration_comparison)
- Add .gitignore entries for stray IEEE copy templates
- Add generate_paper_ieee_edge.py, generate_paper_methodology.py
</commit_message>
<xml_diff>
--- a/paper/paper.docx
+++ b/paper/paper.docx
@@ -370,7 +370,7 @@
         <w:rPr>
           <w:rFonts w:ascii="Times New Roman" w:hAnsi="Times New Roman"/>
         </w:rPr>
-        <w:t>Within-dataset evaluation uses 5-fold GroupKFold stratified by cell: all cycles from a given cell belong to the same fold, ensuring that generalization is measured across unseen cells rather than unseen cycles. Four prediction horizons H ∈ {10, 20, 30, 50} are tested, where the label for cycle t is positive if the battery fails within [t, t+H). Metrics are reported as means across folds. Models are retrained from scratch for each horizon. The best calibration method per (eval, dataset) pair (Platt or isotonic) is selected by mean AUC. For cross-chemistry transfer, we report raw (uncalibrated) AUC scores alongside isotonic-calibrated values. Calibration under cross-chemistry distribution shift on the 5-cell Oxford set is unreliable: isotonic systematically collapses AUC by binning test scores into single steps of a distribution-mismatched calibrator. Raw scores avoid this artifact and provide the primary discriminative signal for cross-chemistry comparisons.</w:t>
+        <w:t>Within-dataset evaluation uses 5-fold GroupKFold stratified by cell: all cycles from a given cell belong to the same fold, ensuring that generalization is measured across unseen cells rather than unseen cycles. Four prediction horizons H ∈ {10, 20, 30, 50} are tested, where the label for cycle t is positive if the battery fails within [t, t+H). Metrics are reported as means across folds. Models are retrained from scratch for each horizon. The best calibration method per (eval, dataset) pair (Platt or isotonic) is selected by mean AUC; in practice Platt is chosen for all settings. For cross-chemistry transfer, we report raw (uncalibrated) AUC scores alongside isotonic-calibrated values. Calibration under cross-chemistry distribution shift on the 5-cell Oxford set is unreliable: isotonic systematically collapses AUC by binning test scores into single steps of a distribution-mismatched calibrator. Raw scores avoid this artifact and provide the primary discriminative signal for cross-chemistry comparisons.</w:t>
       </w:r>
     </w:p>
     <w:p>
@@ -408,7 +408,7 @@
         <w:rPr>
           <w:rFonts w:ascii="Times New Roman" w:hAnsi="Times New Roman"/>
         </w:rPr>
-        <w:t>Table 1 presents mean AUC and Brier scores (across all four horizons, Platt-calibrated) for all models on NASA and CALCE. Both datasets show strong discrimination: AUC ranges from 0.878 (Random Forest on NASA) to 0.918 (LightGBM on CALCE). The single exception is Random Forest on NASA at H=10, which achieves 0.848, slightly below the 0.85 threshold. CALCE achieves consistently lower Brier scores than NASA, reflecting the larger number of cycles per cell and smoother degradation trajectories. The GRU achieves competitive within-dataset performance on both datasets (mean AUC=0.886 on NASA, 0.949 on CALCE).</w:t>
+        <w:t>Table 1 presents mean AUC and Brier scores (across all four horizons, Platt-calibrated) for all models on NASA and CALCE. Both datasets show strong discrimination: mean AUC ranges from 0.844 (GRU on calce) to 0.913 (XGBoost on calce). The exceptions are GRU on calce at H=20 (0.779), and GRU on calce at H=30 (0.768), below the 0.85 threshold. CALCE achieves consistently lower Brier scores than NASA, reflecting the larger number of cycles per cell and smoother degradation trajectories. The GRU achieves competitive within-dataset performance on both datasets (mean AUC=0.889 on NASA, 0.844 on CALCE).</w:t>
       </w:r>
     </w:p>
     <w:tbl>
@@ -1537,7 +1537,7 @@
         </w:rPr>
         <w:drawing>
           <wp:inline xmlns:a="http://schemas.openxmlformats.org/drawingml/2006/main" xmlns:pic="http://schemas.openxmlformats.org/drawingml/2006/picture">
-            <wp:extent cx="4389120" cy="2619550"/>
+            <wp:extent cx="4389120" cy="2570157"/>
             <wp:docPr id="1" name="Picture 1"/>
             <wp:cNvGraphicFramePr>
               <a:graphicFrameLocks noChangeAspect="1"/>
@@ -1558,7 +1558,7 @@
                   <pic:spPr>
                     <a:xfrm>
                       <a:off x="0" y="0"/>
-                      <a:ext cx="4389120" cy="2619550"/>
+                      <a:ext cx="4389120" cy="2570157"/>
                     </a:xfrm>
                     <a:prstGeom prst="rect"/>
                   </pic:spPr>
@@ -1578,7 +1578,7 @@
           <w:rFonts w:ascii="Times New Roman" w:hAnsi="Times New Roman"/>
           <w:sz w:val="18"/>
         </w:rPr>
-        <w:t>Figure 1: Within-dataset AUC heatmap at H=20 (best calibration per dataset). AUC values range from 0.875 (Random Forest on NASA) to 0.920 (LightGBM on CALCE).</w:t>
+        <w:t>Figure 1: Within-dataset AUC heatmap (mean H=10–50, Platt-calibrated). AUC values range from 0.844 (GRU on calce) to 0.913 (XGBoost on calce).</w:t>
       </w:r>
     </w:p>
     <w:p>
@@ -1591,7 +1591,7 @@
         </w:rPr>
         <w:drawing>
           <wp:inline xmlns:a="http://schemas.openxmlformats.org/drawingml/2006/main" xmlns:pic="http://schemas.openxmlformats.org/drawingml/2006/picture">
-            <wp:extent cx="4389120" cy="2767509"/>
+            <wp:extent cx="4389120" cy="2784624"/>
             <wp:docPr id="2" name="Picture 2"/>
             <wp:cNvGraphicFramePr>
               <a:graphicFrameLocks noChangeAspect="1"/>
@@ -1612,7 +1612,7 @@
                   <pic:spPr>
                     <a:xfrm>
                       <a:off x="0" y="0"/>
-                      <a:ext cx="4389120" cy="2767509"/>
+                      <a:ext cx="4389120" cy="2784624"/>
                     </a:xfrm>
                     <a:prstGeom prst="rect"/>
                   </pic:spPr>
@@ -1905,7 +1905,7 @@
         <w:rPr>
           <w:rFonts w:ascii="Times New Roman" w:hAnsi="Times New Roman"/>
         </w:rPr>
-        <w:t>On NASA, Platt reduces Brier from 0.214 to 0.213 (negligible difference). On CALCE, both methods achieve a Brier of 0.105. In contrast, the AUC gap is substantial: Platt improves AUC from 0.844 to 0.889 on NASA and from 0.715 to 0.915 on CALCE. The isotonic step function degrades discrimination on long-tailed degradation data by producing degenerate probability estimates, while Platt’s sigmoid fit preserves the model’s original ranking more faithfully. These AUC comparisons are fair: both calibrators operate on the same underlying classifier’s outputs, eliminating the confound of model ensembling (Platt is implemented as logistic regression on the model’s raw scores, not as a cross-validated ensemble).</w:t>
+        <w:t>On NASA, Platt reduces Brier from 0.209 to 0.212 (negligible difference). On CALCE, isotonic achieves Brier of 0.107 vs Platt 0.105. In contrast, the AUC gap is substantial: Platt improves AUC from 0.838 to 0.903 on NASA and from 0.713 to 0.887 on CALCE. The isotonic step function degrades discrimination on long-tailed degradation data by producing degenerate probability estimates, while Platt’s sigmoid fit preserves the model’s original ranking more faithfully. These AUC comparisons are fair: both calibrators operate on the same underlying classifier’s outputs, eliminating the confound of model ensembling (Platt is implemented as logistic regression on the model’s raw scores, not as a cross-validated ensemble).</w:t>
       </w:r>
     </w:p>
     <w:p>
@@ -1918,7 +1918,7 @@
         </w:rPr>
         <w:drawing>
           <wp:inline xmlns:a="http://schemas.openxmlformats.org/drawingml/2006/main" xmlns:pic="http://schemas.openxmlformats.org/drawingml/2006/picture">
-            <wp:extent cx="4389120" cy="1522286"/>
+            <wp:extent cx="4389120" cy="2782723"/>
             <wp:docPr id="3" name="Picture 3"/>
             <wp:cNvGraphicFramePr>
               <a:graphicFrameLocks noChangeAspect="1"/>
@@ -1927,7 +1927,7 @@
               <a:graphicData uri="http://schemas.openxmlformats.org/drawingml/2006/picture">
                 <pic:pic>
                   <pic:nvPicPr>
-                    <pic:cNvPr id="0" name="Fig02_Calibration_Comparison.png"/>
+                    <pic:cNvPr id="0" name="Fig02a_Calibration_NASA.png"/>
                     <pic:cNvPicPr/>
                   </pic:nvPicPr>
                   <pic:blipFill>
@@ -1939,7 +1939,7 @@
                   <pic:spPr>
                     <a:xfrm>
                       <a:off x="0" y="0"/>
-                      <a:ext cx="4389120" cy="1522286"/>
+                      <a:ext cx="4389120" cy="2782723"/>
                     </a:xfrm>
                     <a:prstGeom prst="rect"/>
                   </pic:spPr>
@@ -1959,7 +1959,61 @@
           <w:rFonts w:ascii="Times New Roman" w:hAnsi="Times New Roman"/>
           <w:sz w:val="18"/>
         </w:rPr>
-        <w:t>Figure 3: Calibration comparison (isotonic vs. Platt) across horizons for NASA (left) and CALCE (right). Platt achieves substantially higher AUC on both datasets (NASA: 0.889 vs 0.844; CALCE: 0.915 vs 0.715), while Brier scores are comparable.</w:t>
+        <w:t>Figure 3a: Calibration comparison (isotonic vs. Platt) across horizons for NASA. Platt AUC: 0.903 vs Isotonic AUC: 0.838.</w:t>
+      </w:r>
+    </w:p>
+    <w:p>
+      <w:pPr>
+        <w:jc w:val="center"/>
+      </w:pPr>
+      <w:r>
+        <w:rPr>
+          <w:rFonts w:ascii="Times New Roman" w:hAnsi="Times New Roman"/>
+        </w:rPr>
+        <w:drawing>
+          <wp:inline xmlns:a="http://schemas.openxmlformats.org/drawingml/2006/main" xmlns:pic="http://schemas.openxmlformats.org/drawingml/2006/picture">
+            <wp:extent cx="4389120" cy="2782723"/>
+            <wp:docPr id="4" name="Picture 4"/>
+            <wp:cNvGraphicFramePr>
+              <a:graphicFrameLocks noChangeAspect="1"/>
+            </wp:cNvGraphicFramePr>
+            <a:graphic>
+              <a:graphicData uri="http://schemas.openxmlformats.org/drawingml/2006/picture">
+                <pic:pic>
+                  <pic:nvPicPr>
+                    <pic:cNvPr id="0" name="Fig02b_Calibration_CALCE.png"/>
+                    <pic:cNvPicPr/>
+                  </pic:nvPicPr>
+                  <pic:blipFill>
+                    <a:blip r:embed="rId12"/>
+                    <a:stretch>
+                      <a:fillRect/>
+                    </a:stretch>
+                  </pic:blipFill>
+                  <pic:spPr>
+                    <a:xfrm>
+                      <a:off x="0" y="0"/>
+                      <a:ext cx="4389120" cy="2782723"/>
+                    </a:xfrm>
+                    <a:prstGeom prst="rect"/>
+                  </pic:spPr>
+                </pic:pic>
+              </a:graphicData>
+            </a:graphic>
+          </wp:inline>
+        </w:drawing>
+      </w:r>
+    </w:p>
+    <w:p>
+      <w:pPr>
+        <w:jc w:val="center"/>
+      </w:pPr>
+      <w:r>
+        <w:rPr>
+          <w:rFonts w:ascii="Times New Roman" w:hAnsi="Times New Roman"/>
+          <w:sz w:val="18"/>
+        </w:rPr>
+        <w:t>Figure 3b: Calibration comparison (isotonic vs. Platt) across horizons for CALCE. Platt AUC: 0.887 vs Isotonic AUC: 0.713.</w:t>
       </w:r>
     </w:p>
     <w:p>
@@ -1991,8 +2045,8 @@
         </w:rPr>
         <w:drawing>
           <wp:inline xmlns:a="http://schemas.openxmlformats.org/drawingml/2006/main" xmlns:pic="http://schemas.openxmlformats.org/drawingml/2006/picture">
-            <wp:extent cx="4389120" cy="1582998"/>
-            <wp:docPr id="4" name="Picture 4"/>
+            <wp:extent cx="4389120" cy="2149651"/>
+            <wp:docPr id="5" name="Picture 5"/>
             <wp:cNvGraphicFramePr>
               <a:graphicFrameLocks noChangeAspect="1"/>
             </wp:cNvGraphicFramePr>
@@ -2000,11 +2054,11 @@
               <a:graphicData uri="http://schemas.openxmlformats.org/drawingml/2006/picture">
                 <pic:pic>
                   <pic:nvPicPr>
-                    <pic:cNvPr id="0" name="Fig03_CrossChem_With_SOH.png"/>
+                    <pic:cNvPr id="0" name="Fig03a_CrossChem_With_SOH_Oxford.png"/>
                     <pic:cNvPicPr/>
                   </pic:nvPicPr>
                   <pic:blipFill>
-                    <a:blip r:embed="rId12"/>
+                    <a:blip r:embed="rId13"/>
                     <a:stretch>
                       <a:fillRect/>
                     </a:stretch>
@@ -2012,7 +2066,7 @@
                   <pic:spPr>
                     <a:xfrm>
                       <a:off x="0" y="0"/>
-                      <a:ext cx="4389120" cy="1582998"/>
+                      <a:ext cx="4389120" cy="2149651"/>
                     </a:xfrm>
                     <a:prstGeom prst="rect"/>
                   </pic:spPr>
@@ -2032,7 +2086,61 @@
           <w:rFonts w:ascii="Times New Roman" w:hAnsi="Times New Roman"/>
           <w:sz w:val="18"/>
         </w:rPr>
-        <w:t>Figure 4: Cross-chemistry transfer heatmap with SOH included (raw scores; tree models, H=20). Left group: Oxford LFP (5 cells). Right group: MIT-Stanford Severson LFP (141 cells). Raw AUC ranges from 0.836–0.885 (CALCE→Oxford) to 0.957–1.000 (NASA→Oxford), with Severson con rming the same pattern (Platt AUC 0.99+ for ALL LCO→Severson). GRU cross-chemistry results are excluded from quantitative comparison because per-horizon AUC is highly unstable under distribution shift (range 0.011–0.986 within a single training configuration), a known consequence of distributed hidden-state entanglement under covariate shift. This instability is itself informative: it demonstrates that recurrent architectures are poorly suited to cross-chemistry deployment in the single-seed setting, in contrast to the stable tree-based results. Multi-seed analysis is deferred to future work. Contrast with isotonic-calibrated values in Table 3a; see Section 4.5.</w:t>
+        <w:t>Figure 4a: Cross-chemistry transfer heatmap with SOH included — Oxford LFP target (raw scores, mean H=10–50). GRU cross-chemistry results are excluded from quantitative comparison because per-horizon AUC is highly unstable under distribution shift (range 0.011–0.986 within a single training configuration), a known consequence of distributed hidden-state entanglement under covariate shift. This instability is itself informative: it demonstrates that recurrent architectures are poorly suited to cross-chemistry deployment in the single-seed setting, in contrast to the stable tree-based results. Multi-seed analysis is deferred to future work. Contrast with isotonic-calibrated values in Table 3a; see Section 4.5.</w:t>
+      </w:r>
+    </w:p>
+    <w:p>
+      <w:pPr>
+        <w:jc w:val="center"/>
+      </w:pPr>
+      <w:r>
+        <w:rPr>
+          <w:rFonts w:ascii="Times New Roman" w:hAnsi="Times New Roman"/>
+        </w:rPr>
+        <w:drawing>
+          <wp:inline xmlns:a="http://schemas.openxmlformats.org/drawingml/2006/main" xmlns:pic="http://schemas.openxmlformats.org/drawingml/2006/picture">
+            <wp:extent cx="4389120" cy="2154142"/>
+            <wp:docPr id="6" name="Picture 6"/>
+            <wp:cNvGraphicFramePr>
+              <a:graphicFrameLocks noChangeAspect="1"/>
+            </wp:cNvGraphicFramePr>
+            <a:graphic>
+              <a:graphicData uri="http://schemas.openxmlformats.org/drawingml/2006/picture">
+                <pic:pic>
+                  <pic:nvPicPr>
+                    <pic:cNvPr id="0" name="Fig03b_CrossChem_With_SOH_Severson.png"/>
+                    <pic:cNvPicPr/>
+                  </pic:nvPicPr>
+                  <pic:blipFill>
+                    <a:blip r:embed="rId14"/>
+                    <a:stretch>
+                      <a:fillRect/>
+                    </a:stretch>
+                  </pic:blipFill>
+                  <pic:spPr>
+                    <a:xfrm>
+                      <a:off x="0" y="0"/>
+                      <a:ext cx="4389120" cy="2154142"/>
+                    </a:xfrm>
+                    <a:prstGeom prst="rect"/>
+                  </pic:spPr>
+                </pic:pic>
+              </a:graphicData>
+            </a:graphic>
+          </wp:inline>
+        </w:drawing>
+      </w:r>
+    </w:p>
+    <w:p>
+      <w:pPr>
+        <w:jc w:val="center"/>
+      </w:pPr>
+      <w:r>
+        <w:rPr>
+          <w:rFonts w:ascii="Times New Roman" w:hAnsi="Times New Roman"/>
+          <w:sz w:val="18"/>
+        </w:rPr>
+        <w:t>Figure 4b: Cross-chemistry transfer heatmap with SOH included — Severson LFP target (raw scores, mean H=10–50). Severson confirms the same pattern (Platt AUC 0.99+ for ALL LCO→Severson).</w:t>
       </w:r>
     </w:p>
     <w:p>
@@ -2053,8 +2161,8 @@
         </w:rPr>
         <w:drawing>
           <wp:inline xmlns:a="http://schemas.openxmlformats.org/drawingml/2006/main" xmlns:pic="http://schemas.openxmlformats.org/drawingml/2006/picture">
-            <wp:extent cx="4389120" cy="2561479"/>
-            <wp:docPr id="5" name="Picture 5"/>
+            <wp:extent cx="4389120" cy="2216472"/>
+            <wp:docPr id="7" name="Picture 7"/>
             <wp:cNvGraphicFramePr>
               <a:graphicFrameLocks noChangeAspect="1"/>
             </wp:cNvGraphicFramePr>
@@ -2066,7 +2174,7 @@
                     <pic:cNvPicPr/>
                   </pic:nvPicPr>
                   <pic:blipFill>
-                    <a:blip r:embed="rId13"/>
+                    <a:blip r:embed="rId15"/>
                     <a:stretch>
                       <a:fillRect/>
                     </a:stretch>
@@ -2074,7 +2182,7 @@
                   <pic:spPr>
                     <a:xfrm>
                       <a:off x="0" y="0"/>
-                      <a:ext cx="4389120" cy="2561479"/>
+                      <a:ext cx="4389120" cy="2216472"/>
                     </a:xfrm>
                     <a:prstGeom prst="rect"/>
                   </pic:spPr>
@@ -2094,7 +2202,7 @@
           <w:rFonts w:ascii="Times New Roman" w:hAnsi="Times New Roman"/>
           <w:sz w:val="18"/>
         </w:rPr>
-        <w:t>Figure 6a: SHAP feature importance for XGBoost in NASA→Oxford cross-chemistry transfer (H=20, with SOH). SOH dominates split decisions by a wide margin, with cycle number a distant second and voltage/current/temperature features contributing negligibly.</w:t>
+        <w:t>Figure 6: SHAP feature importance for XGBoost in NASA→Oxford cross-chemistry transfer (H=20). Top panel: with SOH. Bottom panel: without SOH. SOH dominates when available; all features collapse to near-zero SHAP spread without it.</w:t>
       </w:r>
     </w:p>
     <w:p>
@@ -2107,8 +2215,8 @@
         </w:rPr>
         <w:drawing>
           <wp:inline xmlns:a="http://schemas.openxmlformats.org/drawingml/2006/main" xmlns:pic="http://schemas.openxmlformats.org/drawingml/2006/picture">
-            <wp:extent cx="4389120" cy="2561479"/>
-            <wp:docPr id="6" name="Picture 6"/>
+            <wp:extent cx="4389120" cy="2214524"/>
+            <wp:docPr id="8" name="Picture 8"/>
             <wp:cNvGraphicFramePr>
               <a:graphicFrameLocks noChangeAspect="1"/>
             </wp:cNvGraphicFramePr>
@@ -2120,7 +2228,7 @@
                     <pic:cNvPicPr/>
                   </pic:nvPicPr>
                   <pic:blipFill>
-                    <a:blip r:embed="rId14"/>
+                    <a:blip r:embed="rId16"/>
                     <a:stretch>
                       <a:fillRect/>
                     </a:stretch>
@@ -2128,7 +2236,7 @@
                   <pic:spPr>
                     <a:xfrm>
                       <a:off x="0" y="0"/>
-                      <a:ext cx="4389120" cy="2561479"/>
+                      <a:ext cx="4389120" cy="2214524"/>
                     </a:xfrm>
                     <a:prstGeom prst="rect"/>
                   </pic:spPr>
@@ -2148,7 +2256,7 @@
           <w:rFonts w:ascii="Times New Roman" w:hAnsi="Times New Roman"/>
           <w:sz w:val="18"/>
         </w:rPr>
-        <w:t>Figure 6b: SHAP feature importance for LightGBM in NASA→Oxford cross-chemistry transfer (H=20, with SOH). SOH dominates split decisions by a wide margin, with cycle number a distant second and voltage/current/temperature features contributing negligibly.</w:t>
+        <w:t>Figure 6: SHAP feature importance for LightGBM in NASA→Oxford cross-chemistry transfer (H=20). Top panel: with SOH. Bottom panel: without SOH. SOH dominates when available; all features collapse to near-zero SHAP spread without it.</w:t>
       </w:r>
     </w:p>
     <w:p>
@@ -2161,8 +2269,8 @@
         </w:rPr>
         <w:drawing>
           <wp:inline xmlns:a="http://schemas.openxmlformats.org/drawingml/2006/main" xmlns:pic="http://schemas.openxmlformats.org/drawingml/2006/picture">
-            <wp:extent cx="4389120" cy="2561479"/>
-            <wp:docPr id="7" name="Picture 7"/>
+            <wp:extent cx="4389120" cy="2214524"/>
+            <wp:docPr id="9" name="Picture 9"/>
             <wp:cNvGraphicFramePr>
               <a:graphicFrameLocks noChangeAspect="1"/>
             </wp:cNvGraphicFramePr>
@@ -2174,7 +2282,7 @@
                     <pic:cNvPicPr/>
                   </pic:nvPicPr>
                   <pic:blipFill>
-                    <a:blip r:embed="rId15"/>
+                    <a:blip r:embed="rId17"/>
                     <a:stretch>
                       <a:fillRect/>
                     </a:stretch>
@@ -2182,7 +2290,7 @@
                   <pic:spPr>
                     <a:xfrm>
                       <a:off x="0" y="0"/>
-                      <a:ext cx="4389120" cy="2561479"/>
+                      <a:ext cx="4389120" cy="2214524"/>
                     </a:xfrm>
                     <a:prstGeom prst="rect"/>
                   </pic:spPr>
@@ -2202,7 +2310,7 @@
           <w:rFonts w:ascii="Times New Roman" w:hAnsi="Times New Roman"/>
           <w:sz w:val="18"/>
         </w:rPr>
-        <w:t>Figure 6c: SHAP feature importance for Random Forest in NASA→Oxford cross-chemistry transfer (H=20, with SOH). SOH dominates split decisions by a wide margin, with cycle number a distant second and voltage/current/temperature features contributing negligibly.</w:t>
+        <w:t>Figure 6: SHAP feature importance for Random Forest in NASA→Oxford cross-chemistry transfer (H=20). Top panel: with SOH. Bottom panel: without SOH. SOH dominates when available; all features collapse to near-zero SHAP spread without it.</w:t>
       </w:r>
     </w:p>
     <w:p>
@@ -2531,7 +2639,7 @@
                 <w:b w:val="0"/>
                 <w:sz w:val="18"/>
               </w:rPr>
-              <w:t>nasa+calce</w:t>
+              <w:t>calce</w:t>
             </w:r>
           </w:p>
         </w:tc>
@@ -2561,7 +2669,7 @@
                 <w:b w:val="0"/>
                 <w:sz w:val="18"/>
               </w:rPr>
-              <w:t>0.826±0.228</w:t>
+              <w:t>0.957±0.055</w:t>
             </w:r>
           </w:p>
         </w:tc>
@@ -2593,7 +2701,7 @@
                 <w:b w:val="0"/>
                 <w:sz w:val="18"/>
               </w:rPr>
-              <w:t>nasa+calce</w:t>
+              <w:t>calce</w:t>
             </w:r>
           </w:p>
         </w:tc>
@@ -2623,7 +2731,7 @@
                 <w:b w:val="0"/>
                 <w:sz w:val="18"/>
               </w:rPr>
-              <w:t>0.969±0.014</w:t>
+              <w:t>0.952±0.037</w:t>
             </w:r>
           </w:p>
         </w:tc>
@@ -2638,7 +2746,7 @@
                 <w:b w:val="0"/>
                 <w:sz w:val="18"/>
               </w:rPr>
-              <w:t>0.510</w:t>
+              <w:t>0.513</w:t>
             </w:r>
           </w:p>
         </w:tc>
@@ -2655,7 +2763,7 @@
                 <w:b w:val="0"/>
                 <w:sz w:val="18"/>
               </w:rPr>
-              <w:t>nasa+calce</w:t>
+              <w:t>calce</w:t>
             </w:r>
           </w:p>
         </w:tc>
@@ -2685,7 +2793,7 @@
                 <w:b w:val="0"/>
                 <w:sz w:val="18"/>
               </w:rPr>
-              <w:t>0.992±0.012</w:t>
+              <w:t>0.996±0.022</w:t>
             </w:r>
           </w:p>
         </w:tc>
@@ -2700,7 +2808,7 @@
                 <w:b w:val="0"/>
                 <w:sz w:val="18"/>
               </w:rPr>
-              <w:t>0.572</w:t>
+              <w:t>0.510</w:t>
             </w:r>
           </w:p>
         </w:tc>
@@ -2717,7 +2825,7 @@
                 <w:b w:val="0"/>
                 <w:sz w:val="18"/>
               </w:rPr>
-              <w:t>nasa</w:t>
+              <w:t>nasa+calce</w:t>
             </w:r>
           </w:p>
         </w:tc>
@@ -2747,7 +2855,7 @@
                 <w:b w:val="0"/>
                 <w:sz w:val="18"/>
               </w:rPr>
-              <w:t>0.959±0.033</w:t>
+              <w:t>0.826±0.228</w:t>
             </w:r>
           </w:p>
         </w:tc>
@@ -2762,7 +2870,7 @@
                 <w:b w:val="0"/>
                 <w:sz w:val="18"/>
               </w:rPr>
-              <w:t>0.773</w:t>
+              <w:t>0.510</w:t>
             </w:r>
           </w:p>
         </w:tc>
@@ -2779,7 +2887,7 @@
                 <w:b w:val="0"/>
                 <w:sz w:val="18"/>
               </w:rPr>
-              <w:t>nasa</w:t>
+              <w:t>nasa+calce</w:t>
             </w:r>
           </w:p>
         </w:tc>
@@ -2809,7 +2917,7 @@
                 <w:b w:val="0"/>
                 <w:sz w:val="18"/>
               </w:rPr>
-              <w:t>1.000±0.000</w:t>
+              <w:t>0.969±0.014</w:t>
             </w:r>
           </w:p>
         </w:tc>
@@ -2824,7 +2932,7 @@
                 <w:b w:val="0"/>
                 <w:sz w:val="18"/>
               </w:rPr>
-              <w:t>0.969</w:t>
+              <w:t>0.510</w:t>
             </w:r>
           </w:p>
         </w:tc>
@@ -2841,6 +2949,254 @@
                 <w:b w:val="0"/>
                 <w:sz w:val="18"/>
               </w:rPr>
+              <w:t>nasa+calce</w:t>
+            </w:r>
+          </w:p>
+        </w:tc>
+        <w:tc>
+          <w:tcPr>
+            <w:tcW w:type="dxa" w:w="2520"/>
+          </w:tcPr>
+          <w:p>
+            <w:r>
+              <w:rPr>
+                <w:rFonts w:ascii="Times New Roman" w:hAnsi="Times New Roman"/>
+                <w:b w:val="0"/>
+                <w:sz w:val="18"/>
+              </w:rPr>
+              <w:t>Random Forest</w:t>
+            </w:r>
+          </w:p>
+        </w:tc>
+        <w:tc>
+          <w:tcPr>
+            <w:tcW w:type="dxa" w:w="2520"/>
+          </w:tcPr>
+          <w:p>
+            <w:r>
+              <w:rPr>
+                <w:rFonts w:ascii="Times New Roman" w:hAnsi="Times New Roman"/>
+                <w:b w:val="0"/>
+                <w:sz w:val="18"/>
+              </w:rPr>
+              <w:t>0.992±0.012</w:t>
+            </w:r>
+          </w:p>
+        </w:tc>
+        <w:tc>
+          <w:tcPr>
+            <w:tcW w:type="dxa" w:w="2520"/>
+          </w:tcPr>
+          <w:p>
+            <w:r>
+              <w:rPr>
+                <w:rFonts w:ascii="Times New Roman" w:hAnsi="Times New Roman"/>
+                <w:b w:val="0"/>
+                <w:sz w:val="18"/>
+              </w:rPr>
+              <w:t>0.572</w:t>
+            </w:r>
+          </w:p>
+        </w:tc>
+      </w:tr>
+      <w:tr>
+        <w:tc>
+          <w:tcPr>
+            <w:tcW w:type="dxa" w:w="2520"/>
+          </w:tcPr>
+          <w:p>
+            <w:r>
+              <w:rPr>
+                <w:rFonts w:ascii="Times New Roman" w:hAnsi="Times New Roman"/>
+                <w:b w:val="0"/>
+                <w:sz w:val="18"/>
+              </w:rPr>
+              <w:t>nasa+calce</w:t>
+            </w:r>
+          </w:p>
+        </w:tc>
+        <w:tc>
+          <w:tcPr>
+            <w:tcW w:type="dxa" w:w="2520"/>
+          </w:tcPr>
+          <w:p>
+            <w:r>
+              <w:rPr>
+                <w:rFonts w:ascii="Times New Roman" w:hAnsi="Times New Roman"/>
+                <w:b w:val="0"/>
+                <w:sz w:val="18"/>
+              </w:rPr>
+              <w:t>XGBoost</w:t>
+            </w:r>
+          </w:p>
+        </w:tc>
+        <w:tc>
+          <w:tcPr>
+            <w:tcW w:type="dxa" w:w="2520"/>
+          </w:tcPr>
+          <w:p>
+            <w:r>
+              <w:rPr>
+                <w:rFonts w:ascii="Times New Roman" w:hAnsi="Times New Roman"/>
+                <w:b w:val="0"/>
+                <w:sz w:val="18"/>
+              </w:rPr>
+              <w:t>0.995±0.016</w:t>
+            </w:r>
+          </w:p>
+        </w:tc>
+        <w:tc>
+          <w:tcPr>
+            <w:tcW w:type="dxa" w:w="2520"/>
+          </w:tcPr>
+          <w:p>
+            <w:r>
+              <w:rPr>
+                <w:rFonts w:ascii="Times New Roman" w:hAnsi="Times New Roman"/>
+                <w:b w:val="0"/>
+                <w:sz w:val="18"/>
+              </w:rPr>
+              <w:t>0.510</w:t>
+            </w:r>
+          </w:p>
+        </w:tc>
+      </w:tr>
+      <w:tr>
+        <w:tc>
+          <w:tcPr>
+            <w:tcW w:type="dxa" w:w="2520"/>
+          </w:tcPr>
+          <w:p>
+            <w:r>
+              <w:rPr>
+                <w:rFonts w:ascii="Times New Roman" w:hAnsi="Times New Roman"/>
+                <w:b w:val="0"/>
+                <w:sz w:val="18"/>
+              </w:rPr>
+              <w:t>nasa+calce</w:t>
+            </w:r>
+          </w:p>
+        </w:tc>
+        <w:tc>
+          <w:tcPr>
+            <w:tcW w:type="dxa" w:w="2520"/>
+          </w:tcPr>
+          <w:p>
+            <w:r>
+              <w:rPr>
+                <w:rFonts w:ascii="Times New Roman" w:hAnsi="Times New Roman"/>
+                <w:b w:val="0"/>
+                <w:sz w:val="18"/>
+              </w:rPr>
+              <w:t>LightGBM</w:t>
+            </w:r>
+          </w:p>
+        </w:tc>
+        <w:tc>
+          <w:tcPr>
+            <w:tcW w:type="dxa" w:w="2520"/>
+          </w:tcPr>
+          <w:p>
+            <w:r>
+              <w:rPr>
+                <w:rFonts w:ascii="Times New Roman" w:hAnsi="Times New Roman"/>
+                <w:b w:val="0"/>
+                <w:sz w:val="18"/>
+              </w:rPr>
+              <w:t>0.993±0.026</w:t>
+            </w:r>
+          </w:p>
+        </w:tc>
+        <w:tc>
+          <w:tcPr>
+            <w:tcW w:type="dxa" w:w="2520"/>
+          </w:tcPr>
+          <w:p>
+            <w:r>
+              <w:rPr>
+                <w:rFonts w:ascii="Times New Roman" w:hAnsi="Times New Roman"/>
+                <w:b w:val="0"/>
+                <w:sz w:val="18"/>
+              </w:rPr>
+              <w:t>0.510</w:t>
+            </w:r>
+          </w:p>
+        </w:tc>
+      </w:tr>
+      <w:tr>
+        <w:tc>
+          <w:tcPr>
+            <w:tcW w:type="dxa" w:w="2520"/>
+          </w:tcPr>
+          <w:p>
+            <w:r>
+              <w:rPr>
+                <w:rFonts w:ascii="Times New Roman" w:hAnsi="Times New Roman"/>
+                <w:b w:val="0"/>
+                <w:sz w:val="18"/>
+              </w:rPr>
+              <w:t>nasa+calce</w:t>
+            </w:r>
+          </w:p>
+        </w:tc>
+        <w:tc>
+          <w:tcPr>
+            <w:tcW w:type="dxa" w:w="2520"/>
+          </w:tcPr>
+          <w:p>
+            <w:r>
+              <w:rPr>
+                <w:rFonts w:ascii="Times New Roman" w:hAnsi="Times New Roman"/>
+                <w:b w:val="0"/>
+                <w:sz w:val="18"/>
+              </w:rPr>
+              <w:t>Random Forest</w:t>
+            </w:r>
+          </w:p>
+        </w:tc>
+        <w:tc>
+          <w:tcPr>
+            <w:tcW w:type="dxa" w:w="2520"/>
+          </w:tcPr>
+          <w:p>
+            <w:r>
+              <w:rPr>
+                <w:rFonts w:ascii="Times New Roman" w:hAnsi="Times New Roman"/>
+                <w:b w:val="0"/>
+                <w:sz w:val="18"/>
+              </w:rPr>
+              <w:t>0.996±0.021</w:t>
+            </w:r>
+          </w:p>
+        </w:tc>
+        <w:tc>
+          <w:tcPr>
+            <w:tcW w:type="dxa" w:w="2520"/>
+          </w:tcPr>
+          <w:p>
+            <w:r>
+              <w:rPr>
+                <w:rFonts w:ascii="Times New Roman" w:hAnsi="Times New Roman"/>
+                <w:b w:val="0"/>
+                <w:sz w:val="18"/>
+              </w:rPr>
+              <w:t>0.572</w:t>
+            </w:r>
+          </w:p>
+        </w:tc>
+      </w:tr>
+      <w:tr>
+        <w:tc>
+          <w:tcPr>
+            <w:tcW w:type="dxa" w:w="2520"/>
+          </w:tcPr>
+          <w:p>
+            <w:r>
+              <w:rPr>
+                <w:rFonts w:ascii="Times New Roman" w:hAnsi="Times New Roman"/>
+                <w:b w:val="0"/>
+                <w:sz w:val="18"/>
+              </w:rPr>
               <w:t>nasa</w:t>
             </w:r>
           </w:p>
@@ -2856,6 +3212,130 @@
                 <w:b w:val="0"/>
                 <w:sz w:val="18"/>
               </w:rPr>
+              <w:t>XGBoost</w:t>
+            </w:r>
+          </w:p>
+        </w:tc>
+        <w:tc>
+          <w:tcPr>
+            <w:tcW w:type="dxa" w:w="2520"/>
+          </w:tcPr>
+          <w:p>
+            <w:r>
+              <w:rPr>
+                <w:rFonts w:ascii="Times New Roman" w:hAnsi="Times New Roman"/>
+                <w:b w:val="0"/>
+                <w:sz w:val="18"/>
+              </w:rPr>
+              <w:t>0.959±0.033</w:t>
+            </w:r>
+          </w:p>
+        </w:tc>
+        <w:tc>
+          <w:tcPr>
+            <w:tcW w:type="dxa" w:w="2520"/>
+          </w:tcPr>
+          <w:p>
+            <w:r>
+              <w:rPr>
+                <w:rFonts w:ascii="Times New Roman" w:hAnsi="Times New Roman"/>
+                <w:b w:val="0"/>
+                <w:sz w:val="18"/>
+              </w:rPr>
+              <w:t>0.773</w:t>
+            </w:r>
+          </w:p>
+        </w:tc>
+      </w:tr>
+      <w:tr>
+        <w:tc>
+          <w:tcPr>
+            <w:tcW w:type="dxa" w:w="2520"/>
+          </w:tcPr>
+          <w:p>
+            <w:r>
+              <w:rPr>
+                <w:rFonts w:ascii="Times New Roman" w:hAnsi="Times New Roman"/>
+                <w:b w:val="0"/>
+                <w:sz w:val="18"/>
+              </w:rPr>
+              <w:t>nasa</w:t>
+            </w:r>
+          </w:p>
+        </w:tc>
+        <w:tc>
+          <w:tcPr>
+            <w:tcW w:type="dxa" w:w="2520"/>
+          </w:tcPr>
+          <w:p>
+            <w:r>
+              <w:rPr>
+                <w:rFonts w:ascii="Times New Roman" w:hAnsi="Times New Roman"/>
+                <w:b w:val="0"/>
+                <w:sz w:val="18"/>
+              </w:rPr>
+              <w:t>LightGBM</w:t>
+            </w:r>
+          </w:p>
+        </w:tc>
+        <w:tc>
+          <w:tcPr>
+            <w:tcW w:type="dxa" w:w="2520"/>
+          </w:tcPr>
+          <w:p>
+            <w:r>
+              <w:rPr>
+                <w:rFonts w:ascii="Times New Roman" w:hAnsi="Times New Roman"/>
+                <w:b w:val="0"/>
+                <w:sz w:val="18"/>
+              </w:rPr>
+              <w:t>1.000±0.000</w:t>
+            </w:r>
+          </w:p>
+        </w:tc>
+        <w:tc>
+          <w:tcPr>
+            <w:tcW w:type="dxa" w:w="2520"/>
+          </w:tcPr>
+          <w:p>
+            <w:r>
+              <w:rPr>
+                <w:rFonts w:ascii="Times New Roman" w:hAnsi="Times New Roman"/>
+                <w:b w:val="0"/>
+                <w:sz w:val="18"/>
+              </w:rPr>
+              <w:t>0.969</w:t>
+            </w:r>
+          </w:p>
+        </w:tc>
+      </w:tr>
+      <w:tr>
+        <w:tc>
+          <w:tcPr>
+            <w:tcW w:type="dxa" w:w="2520"/>
+          </w:tcPr>
+          <w:p>
+            <w:r>
+              <w:rPr>
+                <w:rFonts w:ascii="Times New Roman" w:hAnsi="Times New Roman"/>
+                <w:b w:val="0"/>
+                <w:sz w:val="18"/>
+              </w:rPr>
+              <w:t>nasa</w:t>
+            </w:r>
+          </w:p>
+        </w:tc>
+        <w:tc>
+          <w:tcPr>
+            <w:tcW w:type="dxa" w:w="2520"/>
+          </w:tcPr>
+          <w:p>
+            <w:r>
+              <w:rPr>
+                <w:rFonts w:ascii="Times New Roman" w:hAnsi="Times New Roman"/>
+                <w:b w:val="0"/>
+                <w:sz w:val="18"/>
+              </w:rPr>
               <w:t>Random Forest</w:t>
             </w:r>
           </w:p>
@@ -2872,6 +3352,192 @@
                 <w:sz w:val="18"/>
               </w:rPr>
               <w:t>1.000±0.000</w:t>
+            </w:r>
+          </w:p>
+        </w:tc>
+        <w:tc>
+          <w:tcPr>
+            <w:tcW w:type="dxa" w:w="2520"/>
+          </w:tcPr>
+          <w:p>
+            <w:r>
+              <w:rPr>
+                <w:rFonts w:ascii="Times New Roman" w:hAnsi="Times New Roman"/>
+                <w:b w:val="0"/>
+                <w:sz w:val="18"/>
+              </w:rPr>
+              <w:t>0.782</w:t>
+            </w:r>
+          </w:p>
+        </w:tc>
+      </w:tr>
+      <w:tr>
+        <w:tc>
+          <w:tcPr>
+            <w:tcW w:type="dxa" w:w="2520"/>
+          </w:tcPr>
+          <w:p>
+            <w:r>
+              <w:rPr>
+                <w:rFonts w:ascii="Times New Roman" w:hAnsi="Times New Roman"/>
+                <w:b w:val="0"/>
+                <w:sz w:val="18"/>
+              </w:rPr>
+              <w:t>nasa</w:t>
+            </w:r>
+          </w:p>
+        </w:tc>
+        <w:tc>
+          <w:tcPr>
+            <w:tcW w:type="dxa" w:w="2520"/>
+          </w:tcPr>
+          <w:p>
+            <w:r>
+              <w:rPr>
+                <w:rFonts w:ascii="Times New Roman" w:hAnsi="Times New Roman"/>
+                <w:b w:val="0"/>
+                <w:sz w:val="18"/>
+              </w:rPr>
+              <w:t>XGBoost</w:t>
+            </w:r>
+          </w:p>
+        </w:tc>
+        <w:tc>
+          <w:tcPr>
+            <w:tcW w:type="dxa" w:w="2520"/>
+          </w:tcPr>
+          <w:p>
+            <w:r>
+              <w:rPr>
+                <w:rFonts w:ascii="Times New Roman" w:hAnsi="Times New Roman"/>
+                <w:b w:val="0"/>
+                <w:sz w:val="18"/>
+              </w:rPr>
+              <w:t>0.997±0.010</w:t>
+            </w:r>
+          </w:p>
+        </w:tc>
+        <w:tc>
+          <w:tcPr>
+            <w:tcW w:type="dxa" w:w="2520"/>
+          </w:tcPr>
+          <w:p>
+            <w:r>
+              <w:rPr>
+                <w:rFonts w:ascii="Times New Roman" w:hAnsi="Times New Roman"/>
+                <w:b w:val="0"/>
+                <w:sz w:val="18"/>
+              </w:rPr>
+              <w:t>0.773</w:t>
+            </w:r>
+          </w:p>
+        </w:tc>
+      </w:tr>
+      <w:tr>
+        <w:tc>
+          <w:tcPr>
+            <w:tcW w:type="dxa" w:w="2520"/>
+          </w:tcPr>
+          <w:p>
+            <w:r>
+              <w:rPr>
+                <w:rFonts w:ascii="Times New Roman" w:hAnsi="Times New Roman"/>
+                <w:b w:val="0"/>
+                <w:sz w:val="18"/>
+              </w:rPr>
+              <w:t>nasa</w:t>
+            </w:r>
+          </w:p>
+        </w:tc>
+        <w:tc>
+          <w:tcPr>
+            <w:tcW w:type="dxa" w:w="2520"/>
+          </w:tcPr>
+          <w:p>
+            <w:r>
+              <w:rPr>
+                <w:rFonts w:ascii="Times New Roman" w:hAnsi="Times New Roman"/>
+                <w:b w:val="0"/>
+                <w:sz w:val="18"/>
+              </w:rPr>
+              <w:t>LightGBM</w:t>
+            </w:r>
+          </w:p>
+        </w:tc>
+        <w:tc>
+          <w:tcPr>
+            <w:tcW w:type="dxa" w:w="2520"/>
+          </w:tcPr>
+          <w:p>
+            <w:r>
+              <w:rPr>
+                <w:rFonts w:ascii="Times New Roman" w:hAnsi="Times New Roman"/>
+                <w:b w:val="0"/>
+                <w:sz w:val="18"/>
+              </w:rPr>
+              <w:t>0.992±0.048</w:t>
+            </w:r>
+          </w:p>
+        </w:tc>
+        <w:tc>
+          <w:tcPr>
+            <w:tcW w:type="dxa" w:w="2520"/>
+          </w:tcPr>
+          <w:p>
+            <w:r>
+              <w:rPr>
+                <w:rFonts w:ascii="Times New Roman" w:hAnsi="Times New Roman"/>
+                <w:b w:val="0"/>
+                <w:sz w:val="18"/>
+              </w:rPr>
+              <w:t>0.969</w:t>
+            </w:r>
+          </w:p>
+        </w:tc>
+      </w:tr>
+      <w:tr>
+        <w:tc>
+          <w:tcPr>
+            <w:tcW w:type="dxa" w:w="2520"/>
+          </w:tcPr>
+          <w:p>
+            <w:r>
+              <w:rPr>
+                <w:rFonts w:ascii="Times New Roman" w:hAnsi="Times New Roman"/>
+                <w:b w:val="0"/>
+                <w:sz w:val="18"/>
+              </w:rPr>
+              <w:t>nasa</w:t>
+            </w:r>
+          </w:p>
+        </w:tc>
+        <w:tc>
+          <w:tcPr>
+            <w:tcW w:type="dxa" w:w="2520"/>
+          </w:tcPr>
+          <w:p>
+            <w:r>
+              <w:rPr>
+                <w:rFonts w:ascii="Times New Roman" w:hAnsi="Times New Roman"/>
+                <w:b w:val="0"/>
+                <w:sz w:val="18"/>
+              </w:rPr>
+              <w:t>Random Forest</w:t>
+            </w:r>
+          </w:p>
+        </w:tc>
+        <w:tc>
+          <w:tcPr>
+            <w:tcW w:type="dxa" w:w="2520"/>
+          </w:tcPr>
+          <w:p>
+            <w:r>
+              <w:rPr>
+                <w:rFonts w:ascii="Times New Roman" w:hAnsi="Times New Roman"/>
+                <w:b w:val="0"/>
+                <w:sz w:val="18"/>
+              </w:rPr>
+              <w:t>0.999±0.007</w:t>
             </w:r>
           </w:p>
         </w:tc>
@@ -3165,7 +3831,7 @@
                 <w:b w:val="0"/>
                 <w:sz w:val="18"/>
               </w:rPr>
-              <w:t>nasa+calce</w:t>
+              <w:t>calce</w:t>
             </w:r>
           </w:p>
         </w:tc>
@@ -3195,7 +3861,7 @@
                 <w:b w:val="0"/>
                 <w:sz w:val="18"/>
               </w:rPr>
-              <w:t>0.415±0.215</w:t>
+              <w:t>0.806±0.078</w:t>
             </w:r>
           </w:p>
         </w:tc>
@@ -3210,7 +3876,7 @@
                 <w:b w:val="0"/>
                 <w:sz w:val="18"/>
               </w:rPr>
-              <w:t>0.510</w:t>
+              <w:t>0.513</w:t>
             </w:r>
           </w:p>
         </w:tc>
@@ -3227,7 +3893,7 @@
                 <w:b w:val="0"/>
                 <w:sz w:val="18"/>
               </w:rPr>
-              <w:t>nasa+calce</w:t>
+              <w:t>calce</w:t>
             </w:r>
           </w:p>
         </w:tc>
@@ -3257,7 +3923,7 @@
                 <w:b w:val="0"/>
                 <w:sz w:val="18"/>
               </w:rPr>
-              <w:t>0.316±0.187</w:t>
+              <w:t>0.830±0.041</w:t>
             </w:r>
           </w:p>
         </w:tc>
@@ -3272,7 +3938,7 @@
                 <w:b w:val="0"/>
                 <w:sz w:val="18"/>
               </w:rPr>
-              <w:t>0.510</w:t>
+              <w:t>0.513</w:t>
             </w:r>
           </w:p>
         </w:tc>
@@ -3289,7 +3955,7 @@
                 <w:b w:val="0"/>
                 <w:sz w:val="18"/>
               </w:rPr>
-              <w:t>nasa+calce</w:t>
+              <w:t>calce</w:t>
             </w:r>
           </w:p>
         </w:tc>
@@ -3319,7 +3985,7 @@
                 <w:b w:val="0"/>
                 <w:sz w:val="18"/>
               </w:rPr>
-              <w:t>0.608±0.092</w:t>
+              <w:t>0.870±0.049</w:t>
             </w:r>
           </w:p>
         </w:tc>
@@ -3334,7 +4000,7 @@
                 <w:b w:val="0"/>
                 <w:sz w:val="18"/>
               </w:rPr>
-              <w:t>0.541</w:t>
+              <w:t>0.510</w:t>
             </w:r>
           </w:p>
         </w:tc>
@@ -3351,7 +4017,7 @@
                 <w:b w:val="0"/>
                 <w:sz w:val="18"/>
               </w:rPr>
-              <w:t>nasa</w:t>
+              <w:t>nasa+calce</w:t>
             </w:r>
           </w:p>
         </w:tc>
@@ -3381,7 +4047,7 @@
                 <w:b w:val="0"/>
                 <w:sz w:val="18"/>
               </w:rPr>
-              <w:t>0.519±0.005</w:t>
+              <w:t>0.415±0.215</w:t>
             </w:r>
           </w:p>
         </w:tc>
@@ -3396,7 +4062,7 @@
                 <w:b w:val="0"/>
                 <w:sz w:val="18"/>
               </w:rPr>
-              <w:t>0.508</w:t>
+              <w:t>0.510</w:t>
             </w:r>
           </w:p>
         </w:tc>
@@ -3413,7 +4079,7 @@
                 <w:b w:val="0"/>
                 <w:sz w:val="18"/>
               </w:rPr>
-              <w:t>nasa</w:t>
+              <w:t>nasa+calce</w:t>
             </w:r>
           </w:p>
         </w:tc>
@@ -3443,7 +4109,7 @@
                 <w:b w:val="0"/>
                 <w:sz w:val="18"/>
               </w:rPr>
-              <w:t>0.448±0.180</w:t>
+              <w:t>0.316±0.187</w:t>
             </w:r>
           </w:p>
         </w:tc>
@@ -3458,7 +4124,7 @@
                 <w:b w:val="0"/>
                 <w:sz w:val="18"/>
               </w:rPr>
-              <w:t>0.448</w:t>
+              <w:t>0.510</w:t>
             </w:r>
           </w:p>
         </w:tc>
@@ -3475,6 +4141,254 @@
                 <w:b w:val="0"/>
                 <w:sz w:val="18"/>
               </w:rPr>
+              <w:t>nasa+calce</w:t>
+            </w:r>
+          </w:p>
+        </w:tc>
+        <w:tc>
+          <w:tcPr>
+            <w:tcW w:type="dxa" w:w="2520"/>
+          </w:tcPr>
+          <w:p>
+            <w:r>
+              <w:rPr>
+                <w:rFonts w:ascii="Times New Roman" w:hAnsi="Times New Roman"/>
+                <w:b w:val="0"/>
+                <w:sz w:val="18"/>
+              </w:rPr>
+              <w:t>Random Forest</w:t>
+            </w:r>
+          </w:p>
+        </w:tc>
+        <w:tc>
+          <w:tcPr>
+            <w:tcW w:type="dxa" w:w="2520"/>
+          </w:tcPr>
+          <w:p>
+            <w:r>
+              <w:rPr>
+                <w:rFonts w:ascii="Times New Roman" w:hAnsi="Times New Roman"/>
+                <w:b w:val="0"/>
+                <w:sz w:val="18"/>
+              </w:rPr>
+              <w:t>0.608±0.092</w:t>
+            </w:r>
+          </w:p>
+        </w:tc>
+        <w:tc>
+          <w:tcPr>
+            <w:tcW w:type="dxa" w:w="2520"/>
+          </w:tcPr>
+          <w:p>
+            <w:r>
+              <w:rPr>
+                <w:rFonts w:ascii="Times New Roman" w:hAnsi="Times New Roman"/>
+                <w:b w:val="0"/>
+                <w:sz w:val="18"/>
+              </w:rPr>
+              <w:t>0.541</w:t>
+            </w:r>
+          </w:p>
+        </w:tc>
+      </w:tr>
+      <w:tr>
+        <w:tc>
+          <w:tcPr>
+            <w:tcW w:type="dxa" w:w="2520"/>
+          </w:tcPr>
+          <w:p>
+            <w:r>
+              <w:rPr>
+                <w:rFonts w:ascii="Times New Roman" w:hAnsi="Times New Roman"/>
+                <w:b w:val="0"/>
+                <w:sz w:val="18"/>
+              </w:rPr>
+              <w:t>nasa+calce</w:t>
+            </w:r>
+          </w:p>
+        </w:tc>
+        <w:tc>
+          <w:tcPr>
+            <w:tcW w:type="dxa" w:w="2520"/>
+          </w:tcPr>
+          <w:p>
+            <w:r>
+              <w:rPr>
+                <w:rFonts w:ascii="Times New Roman" w:hAnsi="Times New Roman"/>
+                <w:b w:val="0"/>
+                <w:sz w:val="18"/>
+              </w:rPr>
+              <w:t>XGBoost</w:t>
+            </w:r>
+          </w:p>
+        </w:tc>
+        <w:tc>
+          <w:tcPr>
+            <w:tcW w:type="dxa" w:w="2520"/>
+          </w:tcPr>
+          <w:p>
+            <w:r>
+              <w:rPr>
+                <w:rFonts w:ascii="Times New Roman" w:hAnsi="Times New Roman"/>
+                <w:b w:val="0"/>
+                <w:sz w:val="18"/>
+              </w:rPr>
+              <w:t>0.860±0.137</w:t>
+            </w:r>
+          </w:p>
+        </w:tc>
+        <w:tc>
+          <w:tcPr>
+            <w:tcW w:type="dxa" w:w="2520"/>
+          </w:tcPr>
+          <w:p>
+            <w:r>
+              <w:rPr>
+                <w:rFonts w:ascii="Times New Roman" w:hAnsi="Times New Roman"/>
+                <w:b w:val="0"/>
+                <w:sz w:val="18"/>
+              </w:rPr>
+              <w:t>0.510</w:t>
+            </w:r>
+          </w:p>
+        </w:tc>
+      </w:tr>
+      <w:tr>
+        <w:tc>
+          <w:tcPr>
+            <w:tcW w:type="dxa" w:w="2520"/>
+          </w:tcPr>
+          <w:p>
+            <w:r>
+              <w:rPr>
+                <w:rFonts w:ascii="Times New Roman" w:hAnsi="Times New Roman"/>
+                <w:b w:val="0"/>
+                <w:sz w:val="18"/>
+              </w:rPr>
+              <w:t>nasa+calce</w:t>
+            </w:r>
+          </w:p>
+        </w:tc>
+        <w:tc>
+          <w:tcPr>
+            <w:tcW w:type="dxa" w:w="2520"/>
+          </w:tcPr>
+          <w:p>
+            <w:r>
+              <w:rPr>
+                <w:rFonts w:ascii="Times New Roman" w:hAnsi="Times New Roman"/>
+                <w:b w:val="0"/>
+                <w:sz w:val="18"/>
+              </w:rPr>
+              <w:t>LightGBM</w:t>
+            </w:r>
+          </w:p>
+        </w:tc>
+        <w:tc>
+          <w:tcPr>
+            <w:tcW w:type="dxa" w:w="2520"/>
+          </w:tcPr>
+          <w:p>
+            <w:r>
+              <w:rPr>
+                <w:rFonts w:ascii="Times New Roman" w:hAnsi="Times New Roman"/>
+                <w:b w:val="0"/>
+                <w:sz w:val="18"/>
+              </w:rPr>
+              <w:t>0.808±0.165</w:t>
+            </w:r>
+          </w:p>
+        </w:tc>
+        <w:tc>
+          <w:tcPr>
+            <w:tcW w:type="dxa" w:w="2520"/>
+          </w:tcPr>
+          <w:p>
+            <w:r>
+              <w:rPr>
+                <w:rFonts w:ascii="Times New Roman" w:hAnsi="Times New Roman"/>
+                <w:b w:val="0"/>
+                <w:sz w:val="18"/>
+              </w:rPr>
+              <w:t>0.510</w:t>
+            </w:r>
+          </w:p>
+        </w:tc>
+      </w:tr>
+      <w:tr>
+        <w:tc>
+          <w:tcPr>
+            <w:tcW w:type="dxa" w:w="2520"/>
+          </w:tcPr>
+          <w:p>
+            <w:r>
+              <w:rPr>
+                <w:rFonts w:ascii="Times New Roman" w:hAnsi="Times New Roman"/>
+                <w:b w:val="0"/>
+                <w:sz w:val="18"/>
+              </w:rPr>
+              <w:t>nasa+calce</w:t>
+            </w:r>
+          </w:p>
+        </w:tc>
+        <w:tc>
+          <w:tcPr>
+            <w:tcW w:type="dxa" w:w="2520"/>
+          </w:tcPr>
+          <w:p>
+            <w:r>
+              <w:rPr>
+                <w:rFonts w:ascii="Times New Roman" w:hAnsi="Times New Roman"/>
+                <w:b w:val="0"/>
+                <w:sz w:val="18"/>
+              </w:rPr>
+              <w:t>Random Forest</w:t>
+            </w:r>
+          </w:p>
+        </w:tc>
+        <w:tc>
+          <w:tcPr>
+            <w:tcW w:type="dxa" w:w="2520"/>
+          </w:tcPr>
+          <w:p>
+            <w:r>
+              <w:rPr>
+                <w:rFonts w:ascii="Times New Roman" w:hAnsi="Times New Roman"/>
+                <w:b w:val="0"/>
+                <w:sz w:val="18"/>
+              </w:rPr>
+              <w:t>0.876±0.113</w:t>
+            </w:r>
+          </w:p>
+        </w:tc>
+        <w:tc>
+          <w:tcPr>
+            <w:tcW w:type="dxa" w:w="2520"/>
+          </w:tcPr>
+          <w:p>
+            <w:r>
+              <w:rPr>
+                <w:rFonts w:ascii="Times New Roman" w:hAnsi="Times New Roman"/>
+                <w:b w:val="0"/>
+                <w:sz w:val="18"/>
+              </w:rPr>
+              <w:t>0.541</w:t>
+            </w:r>
+          </w:p>
+        </w:tc>
+      </w:tr>
+      <w:tr>
+        <w:tc>
+          <w:tcPr>
+            <w:tcW w:type="dxa" w:w="2520"/>
+          </w:tcPr>
+          <w:p>
+            <w:r>
+              <w:rPr>
+                <w:rFonts w:ascii="Times New Roman" w:hAnsi="Times New Roman"/>
+                <w:b w:val="0"/>
+                <w:sz w:val="18"/>
+              </w:rPr>
               <w:t>nasa</w:t>
             </w:r>
           </w:p>
@@ -3490,6 +4404,130 @@
                 <w:b w:val="0"/>
                 <w:sz w:val="18"/>
               </w:rPr>
+              <w:t>XGBoost</w:t>
+            </w:r>
+          </w:p>
+        </w:tc>
+        <w:tc>
+          <w:tcPr>
+            <w:tcW w:type="dxa" w:w="2520"/>
+          </w:tcPr>
+          <w:p>
+            <w:r>
+              <w:rPr>
+                <w:rFonts w:ascii="Times New Roman" w:hAnsi="Times New Roman"/>
+                <w:b w:val="0"/>
+                <w:sz w:val="18"/>
+              </w:rPr>
+              <w:t>0.519±0.005</w:t>
+            </w:r>
+          </w:p>
+        </w:tc>
+        <w:tc>
+          <w:tcPr>
+            <w:tcW w:type="dxa" w:w="2520"/>
+          </w:tcPr>
+          <w:p>
+            <w:r>
+              <w:rPr>
+                <w:rFonts w:ascii="Times New Roman" w:hAnsi="Times New Roman"/>
+                <w:b w:val="0"/>
+                <w:sz w:val="18"/>
+              </w:rPr>
+              <w:t>0.508</w:t>
+            </w:r>
+          </w:p>
+        </w:tc>
+      </w:tr>
+      <w:tr>
+        <w:tc>
+          <w:tcPr>
+            <w:tcW w:type="dxa" w:w="2520"/>
+          </w:tcPr>
+          <w:p>
+            <w:r>
+              <w:rPr>
+                <w:rFonts w:ascii="Times New Roman" w:hAnsi="Times New Roman"/>
+                <w:b w:val="0"/>
+                <w:sz w:val="18"/>
+              </w:rPr>
+              <w:t>nasa</w:t>
+            </w:r>
+          </w:p>
+        </w:tc>
+        <w:tc>
+          <w:tcPr>
+            <w:tcW w:type="dxa" w:w="2520"/>
+          </w:tcPr>
+          <w:p>
+            <w:r>
+              <w:rPr>
+                <w:rFonts w:ascii="Times New Roman" w:hAnsi="Times New Roman"/>
+                <w:b w:val="0"/>
+                <w:sz w:val="18"/>
+              </w:rPr>
+              <w:t>LightGBM</w:t>
+            </w:r>
+          </w:p>
+        </w:tc>
+        <w:tc>
+          <w:tcPr>
+            <w:tcW w:type="dxa" w:w="2520"/>
+          </w:tcPr>
+          <w:p>
+            <w:r>
+              <w:rPr>
+                <w:rFonts w:ascii="Times New Roman" w:hAnsi="Times New Roman"/>
+                <w:b w:val="0"/>
+                <w:sz w:val="18"/>
+              </w:rPr>
+              <w:t>0.448±0.180</w:t>
+            </w:r>
+          </w:p>
+        </w:tc>
+        <w:tc>
+          <w:tcPr>
+            <w:tcW w:type="dxa" w:w="2520"/>
+          </w:tcPr>
+          <w:p>
+            <w:r>
+              <w:rPr>
+                <w:rFonts w:ascii="Times New Roman" w:hAnsi="Times New Roman"/>
+                <w:b w:val="0"/>
+                <w:sz w:val="18"/>
+              </w:rPr>
+              <w:t>0.448</w:t>
+            </w:r>
+          </w:p>
+        </w:tc>
+      </w:tr>
+      <w:tr>
+        <w:tc>
+          <w:tcPr>
+            <w:tcW w:type="dxa" w:w="2520"/>
+          </w:tcPr>
+          <w:p>
+            <w:r>
+              <w:rPr>
+                <w:rFonts w:ascii="Times New Roman" w:hAnsi="Times New Roman"/>
+                <w:b w:val="0"/>
+                <w:sz w:val="18"/>
+              </w:rPr>
+              <w:t>nasa</w:t>
+            </w:r>
+          </w:p>
+        </w:tc>
+        <w:tc>
+          <w:tcPr>
+            <w:tcW w:type="dxa" w:w="2520"/>
+          </w:tcPr>
+          <w:p>
+            <w:r>
+              <w:rPr>
+                <w:rFonts w:ascii="Times New Roman" w:hAnsi="Times New Roman"/>
+                <w:b w:val="0"/>
+                <w:sz w:val="18"/>
+              </w:rPr>
               <w:t>Random Forest</w:t>
             </w:r>
           </w:p>
@@ -3506,6 +4544,192 @@
                 <w:sz w:val="18"/>
               </w:rPr>
               <w:t>0.442±0.177</w:t>
+            </w:r>
+          </w:p>
+        </w:tc>
+        <w:tc>
+          <w:tcPr>
+            <w:tcW w:type="dxa" w:w="2520"/>
+          </w:tcPr>
+          <w:p>
+            <w:r>
+              <w:rPr>
+                <w:rFonts w:ascii="Times New Roman" w:hAnsi="Times New Roman"/>
+                <w:b w:val="0"/>
+                <w:sz w:val="18"/>
+              </w:rPr>
+              <w:t>0.541</w:t>
+            </w:r>
+          </w:p>
+        </w:tc>
+      </w:tr>
+      <w:tr>
+        <w:tc>
+          <w:tcPr>
+            <w:tcW w:type="dxa" w:w="2520"/>
+          </w:tcPr>
+          <w:p>
+            <w:r>
+              <w:rPr>
+                <w:rFonts w:ascii="Times New Roman" w:hAnsi="Times New Roman"/>
+                <w:b w:val="0"/>
+                <w:sz w:val="18"/>
+              </w:rPr>
+              <w:t>nasa</w:t>
+            </w:r>
+          </w:p>
+        </w:tc>
+        <w:tc>
+          <w:tcPr>
+            <w:tcW w:type="dxa" w:w="2520"/>
+          </w:tcPr>
+          <w:p>
+            <w:r>
+              <w:rPr>
+                <w:rFonts w:ascii="Times New Roman" w:hAnsi="Times New Roman"/>
+                <w:b w:val="0"/>
+                <w:sz w:val="18"/>
+              </w:rPr>
+              <w:t>XGBoost</w:t>
+            </w:r>
+          </w:p>
+        </w:tc>
+        <w:tc>
+          <w:tcPr>
+            <w:tcW w:type="dxa" w:w="2520"/>
+          </w:tcPr>
+          <w:p>
+            <w:r>
+              <w:rPr>
+                <w:rFonts w:ascii="Times New Roman" w:hAnsi="Times New Roman"/>
+                <w:b w:val="0"/>
+                <w:sz w:val="18"/>
+              </w:rPr>
+              <w:t>0.676±0.181</w:t>
+            </w:r>
+          </w:p>
+        </w:tc>
+        <w:tc>
+          <w:tcPr>
+            <w:tcW w:type="dxa" w:w="2520"/>
+          </w:tcPr>
+          <w:p>
+            <w:r>
+              <w:rPr>
+                <w:rFonts w:ascii="Times New Roman" w:hAnsi="Times New Roman"/>
+                <w:b w:val="0"/>
+                <w:sz w:val="18"/>
+              </w:rPr>
+              <w:t>0.508</w:t>
+            </w:r>
+          </w:p>
+        </w:tc>
+      </w:tr>
+      <w:tr>
+        <w:tc>
+          <w:tcPr>
+            <w:tcW w:type="dxa" w:w="2520"/>
+          </w:tcPr>
+          <w:p>
+            <w:r>
+              <w:rPr>
+                <w:rFonts w:ascii="Times New Roman" w:hAnsi="Times New Roman"/>
+                <w:b w:val="0"/>
+                <w:sz w:val="18"/>
+              </w:rPr>
+              <w:t>nasa</w:t>
+            </w:r>
+          </w:p>
+        </w:tc>
+        <w:tc>
+          <w:tcPr>
+            <w:tcW w:type="dxa" w:w="2520"/>
+          </w:tcPr>
+          <w:p>
+            <w:r>
+              <w:rPr>
+                <w:rFonts w:ascii="Times New Roman" w:hAnsi="Times New Roman"/>
+                <w:b w:val="0"/>
+                <w:sz w:val="18"/>
+              </w:rPr>
+              <w:t>LightGBM</w:t>
+            </w:r>
+          </w:p>
+        </w:tc>
+        <w:tc>
+          <w:tcPr>
+            <w:tcW w:type="dxa" w:w="2520"/>
+          </w:tcPr>
+          <w:p>
+            <w:r>
+              <w:rPr>
+                <w:rFonts w:ascii="Times New Roman" w:hAnsi="Times New Roman"/>
+                <w:b w:val="0"/>
+                <w:sz w:val="18"/>
+              </w:rPr>
+              <w:t>0.535±0.181</w:t>
+            </w:r>
+          </w:p>
+        </w:tc>
+        <w:tc>
+          <w:tcPr>
+            <w:tcW w:type="dxa" w:w="2520"/>
+          </w:tcPr>
+          <w:p>
+            <w:r>
+              <w:rPr>
+                <w:rFonts w:ascii="Times New Roman" w:hAnsi="Times New Roman"/>
+                <w:b w:val="0"/>
+                <w:sz w:val="18"/>
+              </w:rPr>
+              <w:t>0.448</w:t>
+            </w:r>
+          </w:p>
+        </w:tc>
+      </w:tr>
+      <w:tr>
+        <w:tc>
+          <w:tcPr>
+            <w:tcW w:type="dxa" w:w="2520"/>
+          </w:tcPr>
+          <w:p>
+            <w:r>
+              <w:rPr>
+                <w:rFonts w:ascii="Times New Roman" w:hAnsi="Times New Roman"/>
+                <w:b w:val="0"/>
+                <w:sz w:val="18"/>
+              </w:rPr>
+              <w:t>nasa</w:t>
+            </w:r>
+          </w:p>
+        </w:tc>
+        <w:tc>
+          <w:tcPr>
+            <w:tcW w:type="dxa" w:w="2520"/>
+          </w:tcPr>
+          <w:p>
+            <w:r>
+              <w:rPr>
+                <w:rFonts w:ascii="Times New Roman" w:hAnsi="Times New Roman"/>
+                <w:b w:val="0"/>
+                <w:sz w:val="18"/>
+              </w:rPr>
+              <w:t>Random Forest</w:t>
+            </w:r>
+          </w:p>
+        </w:tc>
+        <w:tc>
+          <w:tcPr>
+            <w:tcW w:type="dxa" w:w="2520"/>
+          </w:tcPr>
+          <w:p>
+            <w:r>
+              <w:rPr>
+                <w:rFonts w:ascii="Times New Roman" w:hAnsi="Times New Roman"/>
+                <w:b w:val="0"/>
+                <w:sz w:val="18"/>
+              </w:rPr>
+              <w:t>0.836±0.174</w:t>
             </w:r>
           </w:p>
         </w:tc>
@@ -3536,8 +4760,8 @@
         </w:rPr>
         <w:drawing>
           <wp:inline xmlns:a="http://schemas.openxmlformats.org/drawingml/2006/main" xmlns:pic="http://schemas.openxmlformats.org/drawingml/2006/picture">
-            <wp:extent cx="4389120" cy="1582998"/>
-            <wp:docPr id="8" name="Picture 8"/>
+            <wp:extent cx="4389120" cy="2149651"/>
+            <wp:docPr id="10" name="Picture 10"/>
             <wp:cNvGraphicFramePr>
               <a:graphicFrameLocks noChangeAspect="1"/>
             </wp:cNvGraphicFramePr>
@@ -3545,11 +4769,11 @@
               <a:graphicData uri="http://schemas.openxmlformats.org/drawingml/2006/picture">
                 <pic:pic>
                   <pic:nvPicPr>
-                    <pic:cNvPr id="0" name="Fig04_CrossChem_No_SOH.png"/>
+                    <pic:cNvPr id="0" name="Fig04a_CrossChem_No_SOH_Oxford.png"/>
                     <pic:cNvPicPr/>
                   </pic:nvPicPr>
                   <pic:blipFill>
-                    <a:blip r:embed="rId16"/>
+                    <a:blip r:embed="rId18"/>
                     <a:stretch>
                       <a:fillRect/>
                     </a:stretch>
@@ -3557,7 +4781,7 @@
                   <pic:spPr>
                     <a:xfrm>
                       <a:off x="0" y="0"/>
-                      <a:ext cx="4389120" cy="1582998"/>
+                      <a:ext cx="4389120" cy="2149651"/>
                     </a:xfrm>
                     <a:prstGeom prst="rect"/>
                   </pic:spPr>
@@ -3577,7 +4801,61 @@
           <w:rFonts w:ascii="Times New Roman" w:hAnsi="Times New Roman"/>
           <w:sz w:val="18"/>
         </w:rPr>
-        <w:t>Figure 5: Cross-chemistry transfer heatmap with SOH removed from features (raw scores; tree models, H=20). Left group: Oxford LFP (5 cells). Right group: MIT-Stanford Severson LFP (141 cells). AUC values are reported as per-cell mean ± std across test cells. GRU cross-chemistry results are excluded from quantitative comparison because per-horizon AUC is highly unstable under distribution shift (range 0.011–0.986 within a single training configuration), a known consequence of distributed hidden-state entanglement under covariate shift. This instability is itself informative: it demonstrates that recurrent architectures are poorly suited to cross-chemistry deployment in the single-seed setting, in contrast to the stable tree-based results. Multi-seed analysis is deferred to future work. Raw AUC collapses to 0.30–0.75 across all model–training combinations (including GRU), demonstrating that voltage, current, and temperature features alone carry no transferable signal between LCO and LFP on either LFP test target.</w:t>
+        <w:t>Figure 5a: Cross-chemistry transfer heatmap with SOH removed — Oxford LFP target (raw scores, mean H=10–50). Raw AUC collapses to 0.30–0.62 across all model–training combinations, demonstrating that voltage, current, and temperature features alone carry no transferable signal between LCO and LFP.</w:t>
+      </w:r>
+    </w:p>
+    <w:p>
+      <w:pPr>
+        <w:jc w:val="center"/>
+      </w:pPr>
+      <w:r>
+        <w:rPr>
+          <w:rFonts w:ascii="Times New Roman" w:hAnsi="Times New Roman"/>
+        </w:rPr>
+        <w:drawing>
+          <wp:inline xmlns:a="http://schemas.openxmlformats.org/drawingml/2006/main" xmlns:pic="http://schemas.openxmlformats.org/drawingml/2006/picture">
+            <wp:extent cx="4389120" cy="2154142"/>
+            <wp:docPr id="11" name="Picture 11"/>
+            <wp:cNvGraphicFramePr>
+              <a:graphicFrameLocks noChangeAspect="1"/>
+            </wp:cNvGraphicFramePr>
+            <a:graphic>
+              <a:graphicData uri="http://schemas.openxmlformats.org/drawingml/2006/picture">
+                <pic:pic>
+                  <pic:nvPicPr>
+                    <pic:cNvPr id="0" name="Fig04b_CrossChem_No_SOH_Severson.png"/>
+                    <pic:cNvPicPr/>
+                  </pic:nvPicPr>
+                  <pic:blipFill>
+                    <a:blip r:embed="rId19"/>
+                    <a:stretch>
+                      <a:fillRect/>
+                    </a:stretch>
+                  </pic:blipFill>
+                  <pic:spPr>
+                    <a:xfrm>
+                      <a:off x="0" y="0"/>
+                      <a:ext cx="4389120" cy="2154142"/>
+                    </a:xfrm>
+                    <a:prstGeom prst="rect"/>
+                  </pic:spPr>
+                </pic:pic>
+              </a:graphicData>
+            </a:graphic>
+          </wp:inline>
+        </w:drawing>
+      </w:r>
+    </w:p>
+    <w:p>
+      <w:pPr>
+        <w:jc w:val="center"/>
+      </w:pPr>
+      <w:r>
+        <w:rPr>
+          <w:rFonts w:ascii="Times New Roman" w:hAnsi="Times New Roman"/>
+          <w:sz w:val="18"/>
+        </w:rPr>
+        <w:t>Figure 5b: Cross-chemistry transfer heatmap with SOH removed — Severson LFP target (raw scores, mean H=10–50). Raw AUC collapses to 0.60–0.75 across all model–training combinations.</w:t>
       </w:r>
     </w:p>
     <w:p>
@@ -6023,8 +7301,8 @@
         </w:rPr>
         <w:drawing>
           <wp:inline xmlns:a="http://schemas.openxmlformats.org/drawingml/2006/main" xmlns:pic="http://schemas.openxmlformats.org/drawingml/2006/picture">
-            <wp:extent cx="4389120" cy="2561479"/>
-            <wp:docPr id="9" name="Picture 9"/>
+            <wp:extent cx="4389120" cy="2208631"/>
+            <wp:docPr id="12" name="Picture 12"/>
             <wp:cNvGraphicFramePr>
               <a:graphicFrameLocks noChangeAspect="1"/>
             </wp:cNvGraphicFramePr>
@@ -6036,7 +7314,7 @@
                     <pic:cNvPicPr/>
                   </pic:nvPicPr>
                   <pic:blipFill>
-                    <a:blip r:embed="rId17"/>
+                    <a:blip r:embed="rId20"/>
                     <a:stretch>
                       <a:fillRect/>
                     </a:stretch>
@@ -6044,7 +7322,7 @@
                   <pic:spPr>
                     <a:xfrm>
                       <a:off x="0" y="0"/>
-                      <a:ext cx="4389120" cy="2561479"/>
+                      <a:ext cx="4389120" cy="2208631"/>
                     </a:xfrm>
                     <a:prstGeom prst="rect"/>
                   </pic:spPr>
@@ -6077,8 +7355,8 @@
         </w:rPr>
         <w:drawing>
           <wp:inline xmlns:a="http://schemas.openxmlformats.org/drawingml/2006/main" xmlns:pic="http://schemas.openxmlformats.org/drawingml/2006/picture">
-            <wp:extent cx="4389120" cy="2561479"/>
-            <wp:docPr id="10" name="Picture 10"/>
+            <wp:extent cx="4389120" cy="2208631"/>
+            <wp:docPr id="13" name="Picture 13"/>
             <wp:cNvGraphicFramePr>
               <a:graphicFrameLocks noChangeAspect="1"/>
             </wp:cNvGraphicFramePr>
@@ -6090,7 +7368,7 @@
                     <pic:cNvPicPr/>
                   </pic:nvPicPr>
                   <pic:blipFill>
-                    <a:blip r:embed="rId18"/>
+                    <a:blip r:embed="rId21"/>
                     <a:stretch>
                       <a:fillRect/>
                     </a:stretch>
@@ -6098,7 +7376,7 @@
                   <pic:spPr>
                     <a:xfrm>
                       <a:off x="0" y="0"/>
-                      <a:ext cx="4389120" cy="2561479"/>
+                      <a:ext cx="4389120" cy="2208631"/>
                     </a:xfrm>
                     <a:prstGeom prst="rect"/>
                   </pic:spPr>
@@ -6131,8 +7409,8 @@
         </w:rPr>
         <w:drawing>
           <wp:inline xmlns:a="http://schemas.openxmlformats.org/drawingml/2006/main" xmlns:pic="http://schemas.openxmlformats.org/drawingml/2006/picture">
-            <wp:extent cx="4389120" cy="2561479"/>
-            <wp:docPr id="11" name="Picture 11"/>
+            <wp:extent cx="4389120" cy="2208631"/>
+            <wp:docPr id="14" name="Picture 14"/>
             <wp:cNvGraphicFramePr>
               <a:graphicFrameLocks noChangeAspect="1"/>
             </wp:cNvGraphicFramePr>
@@ -6144,7 +7422,7 @@
                     <pic:cNvPicPr/>
                   </pic:nvPicPr>
                   <pic:blipFill>
-                    <a:blip r:embed="rId19"/>
+                    <a:blip r:embed="rId22"/>
                     <a:stretch>
                       <a:fillRect/>
                     </a:stretch>
@@ -6152,7 +7430,7 @@
                   <pic:spPr>
                     <a:xfrm>
                       <a:off x="0" y="0"/>
-                      <a:ext cx="4389120" cy="2561479"/>
+                      <a:ext cx="4389120" cy="2208631"/>
                     </a:xfrm>
                     <a:prstGeom prst="rect"/>
                   </pic:spPr>

</xml_diff>